<commit_message>
Entrega de trabajos por GitHub Classroom
- README: el repositorio público queda para clases y enunciados; cada trabajo,
  sprint y el proyecto se entregan en un repositorio privado de la organización
  Alto-Rendimiento-IA. Sin fork.
- Guía del estudiante (.md y .docx) con la nueva regla de entrega y checklist
- CLAUDE.md: plantillas de Classroom, encabezado de tareas sin botón de Colab,
  revisión entre compañeros con copia en Drive

Co-Authored-By: Claude Opus 5.5 <noreply@anthropic.com>
Claude-Session: https://claude.ai/code/session_01UrDC15FcgWhEDNhbyVi42k
</commit_message>
<xml_diff>
--- a/Guia_estudiante.docx
+++ b/Guia_estudiante.docx
@@ -813,10 +813,10 @@
         <w:rPr>
           <w:b/>
         </w:rPr>
-        <w:t xml:space="preserve">Todo trabajo se guarda en tu fork del repositorio en GitHub</w:t>
-      </w:r>
-      <w:r>
-        <w:t xml:space="preserve"> y se entrega enviando el enlace. Cuenta la última versión guardada antes del inicio de la clase. El paso a paso está en la sección </w:t>
+        <w:t xml:space="preserve">Todo trabajo se guarda en tu repositorio privado del trabajo</w:t>
+      </w:r>
+      <w:r>
+        <w:t xml:space="preserve">, que recibes por GitHub Classroom. No hay que enviar nada: cuenta la última versión guardada antes del inicio de la clase. El paso a paso está en la sección </w:t>
       </w:r>
       <w:hyperlink r:id="rId9" w:history="1">
         <w:r>
@@ -1200,27 +1200,7 @@
         </w:r>
       </w:hyperlink>
       <w:r>
-        <w:t xml:space="preserve">, hacer un </w:t>
-      </w:r>
-      <w:r>
-        <w:rPr>
-          <w:i/>
-        </w:rPr>
-        <w:t xml:space="preserve">fork</w:t>
-      </w:r>
-      <w:r>
-        <w:t xml:space="preserve"> del </w:t>
-      </w:r>
-      <w:hyperlink r:id="rId8" w:history="1">
-        <w:r>
-          <w:rPr>
-            <w:rStyle w:val="Hyperlink"/>
-          </w:rPr>
-          <w:t xml:space="preserve">repositorio del curso</w:t>
-        </w:r>
-      </w:hyperlink>
-      <w:r>
-        <w:t xml:space="preserve"> y enviarle tu usuario al profesor. Instrucciones en </w:t>
+        <w:t xml:space="preserve">, enviarle tu usuario al profesor y conectar Colab con GitHub. Instrucciones en </w:t>
       </w:r>
       <w:hyperlink r:id="rId9" w:history="1">
         <w:r>

</xml_diff>

<commit_message>
Entregas en repositorios privados por estudiante (reemplaza Classroom)
GitHub Classroom fue retirado el 28 de agosto de 2026. Cada estudiante tiene
un repositorio privado Alto-Rendimiento-IA/entregas-<usuario> para todo el año;
el profesor copia todos los repositorios al inicio de la clase y esa copia es
la entrega.

- herramientas/: crear_repos.py (repositorios + invitaciones, también por pareja
  para el proyecto) y recolectar_entregas.py (copia a la hora de entrega), solo
  con la biblioteca estándar
- README, guía del estudiante (.md y .docx) y CLAUDE.md con el nuevo flujo
- .gitignore: lista de estudiantes y entregas recolectadas

Co-Authored-By: Claude Opus 5.5 <noreply@anthropic.com>
Claude-Session: https://claude.ai/code/session_01UrDC15FcgWhEDNhbyVi42k
</commit_message>
<xml_diff>
--- a/Guia_estudiante.docx
+++ b/Guia_estudiante.docx
@@ -813,10 +813,19 @@
         <w:rPr>
           <w:b/>
         </w:rPr>
-        <w:t xml:space="preserve">Todo trabajo se guarda en tu repositorio privado del trabajo</w:t>
-      </w:r>
-      <w:r>
-        <w:t xml:space="preserve">, que recibes por GitHub Classroom. No hay que enviar nada: cuenta la última versión guardada antes del inicio de la clase. El paso a paso está en la sección </w:t>
+        <w:t xml:space="preserve">Todo trabajo se guarda en tu repositorio privado de entregas</w:t>
+      </w:r>
+      <w:r>
+        <w:t xml:space="preserve"> (</w:t>
+      </w:r>
+      <w:r>
+        <w:rPr>
+          <w:rFonts w:ascii="Courier New" w:hAnsi="Courier New"/>
+        </w:rPr>
+        <w:t xml:space="preserve">Alto-Rendimiento-IA/entregas-&lt;tu-usuario&gt;</w:t>
+      </w:r>
+      <w:r>
+        <w:t xml:space="preserve">), en la carpeta del trabajo. No hay que enviar nada: al inicio de la clase el profesor copia todos los repositorios, y lo que esté en el tuyo en ese momento es tu entrega. El paso a paso está en la sección </w:t>
       </w:r>
       <w:hyperlink r:id="rId9" w:history="1">
         <w:r>
@@ -1200,7 +1209,7 @@
         </w:r>
       </w:hyperlink>
       <w:r>
-        <w:t xml:space="preserve">, enviarle tu usuario al profesor y conectar Colab con GitHub. Instrucciones en </w:t>
+        <w:t xml:space="preserve">, enviarle tu usuario al profesor, aceptar la invitación a tu repositorio de entregas cuando llegue y conectar Colab con GitHub. Instrucciones en </w:t>
       </w:r>
       <w:hyperlink r:id="rId9" w:history="1">
         <w:r>

</xml_diff>